<commit_message>
Bugfix | 1) Invalid datatypes will be caught and sent back with error codes 2) Node manual ac control ack not reaching cloud
</commit_message>
<xml_diff>
--- a/Docs/Software Design Document/IR_BLE_Mesh_SW_Document_1.0.docx
+++ b/Docs/Software Design Document/IR_BLE_Mesh_SW_Document_1.0.docx
@@ -2711,7 +2711,19 @@
               <w:rPr>
                 <w:rFonts w:ascii="Calibri Light" w:hAnsi="Calibri Light"/>
               </w:rPr>
-              <w:t>23.01.2025</w:t>
+              <w:t>2</w:t>
+            </w:r>
+            <w:r>
+              <w:rPr>
+                <w:rFonts w:ascii="Calibri Light" w:hAnsi="Calibri Light"/>
+              </w:rPr>
+              <w:t>4</w:t>
+            </w:r>
+            <w:r>
+              <w:rPr>
+                <w:rFonts w:ascii="Calibri Light" w:hAnsi="Calibri Light"/>
+              </w:rPr>
+              <w:t>.01.2025</w:t>
             </w:r>
           </w:p>
         </w:tc>
@@ -33700,6 +33712,8 @@
     <w:rsid w:val="00997DDA"/>
     <w:rsid w:val="00A42C78"/>
     <w:rsid w:val="00A71DBA"/>
+    <w:rsid w:val="00B0043F"/>
+    <w:rsid w:val="00BE0A61"/>
     <w:rsid w:val="00BF70A0"/>
     <w:rsid w:val="00C3009C"/>
     <w:rsid w:val="00D0316D"/>
@@ -34457,6 +34471,10 @@
 </file>
 
 <file path=customXml/item1.xml><?xml version="1.0" encoding="utf-8"?>
+<b:Sources xmlns:b="http://schemas.openxmlformats.org/officeDocument/2006/bibliography" xmlns="http://schemas.openxmlformats.org/officeDocument/2006/bibliography" SelectedStyle="\APASixthEditionOfficeOnline.xsl" StyleName="APA" Version="6"/>
+</file>
+
+<file path=customXml/item2.xml><?xml version="1.0" encoding="utf-8"?>
 <s:customData xmlns="http://www.wps.cn/officeDocument/2013/wpsCustomData" xmlns:s="http://www.wps.cn/officeDocument/2013/wpsCustomData">
   <customSectProps>
     <customSectPr/>
@@ -34467,22 +34485,18 @@
 </s:customData>
 </file>
 
-<file path=customXml/item2.xml><?xml version="1.0" encoding="utf-8"?>
-<b:Sources xmlns:b="http://schemas.openxmlformats.org/officeDocument/2006/bibliography" xmlns="http://schemas.openxmlformats.org/officeDocument/2006/bibliography" SelectedStyle="\APASixthEditionOfficeOnline.xsl" StyleName="APA" Version="6"/>
+<file path=customXml/itemProps1.xml><?xml version="1.0" encoding="utf-8"?>
+<ds:datastoreItem xmlns:ds="http://schemas.openxmlformats.org/officeDocument/2006/customXml" ds:itemID="{14523D6D-8B41-440A-BA0F-34E9C8F63C79}">
+  <ds:schemaRefs>
+    <ds:schemaRef ds:uri="http://schemas.openxmlformats.org/officeDocument/2006/bibliography"/>
+  </ds:schemaRefs>
+</ds:datastoreItem>
 </file>
 
-<file path=customXml/itemProps1.xml><?xml version="1.0" encoding="utf-8"?>
+<file path=customXml/itemProps2.xml><?xml version="1.0" encoding="utf-8"?>
 <ds:datastoreItem xmlns:ds="http://schemas.openxmlformats.org/officeDocument/2006/customXml" ds:itemID="{B1977F7D-205B-4081-913C-38D41E755F92}">
   <ds:schemaRefs>
     <ds:schemaRef ds:uri="http://www.wps.cn/officeDocument/2013/wpsCustomData"/>
   </ds:schemaRefs>
 </ds:datastoreItem>
-</file>
-
-<file path=customXml/itemProps2.xml><?xml version="1.0" encoding="utf-8"?>
-<ds:datastoreItem xmlns:ds="http://schemas.openxmlformats.org/officeDocument/2006/customXml" ds:itemID="{14523D6D-8B41-440A-BA0F-34E9C8F63C79}">
-  <ds:schemaRefs>
-    <ds:schemaRef ds:uri="http://schemas.openxmlformats.org/officeDocument/2006/bibliography"/>
-  </ds:schemaRefs>
-</ds:datastoreItem>
 </file>
</xml_diff>